<commit_message>
refactor: separate generator and ats into clean monorepo structure
- Create generator/ for document generation (CV + cover letter)
- Create ats/ for ATS automation (Workday form filling)
- Move scripts/utils/ to generator/utils/
- Move templates/ to generator/templates/
- Move scripts/ats/ to ats/scripts/
- Update all imports to use generator.* and ats.* namespaces
- Add sys.path manipulation for imports without setuptools
- Update .claude/commands/ for new paths
- Update CLAUDE.md with new structure
- Backup old structure to scripts.old/ and templates.old/

Both projects now share data/ and jobs/ directories while maintaining
clean separation at the code level.
</commit_message>
<xml_diff>
--- a/jobs/Richemont - Finance Accelerator Program - 10.01.2026/Adrian Turion - Richemont - Resume.docx
+++ b/jobs/Richemont - Finance Accelerator Program - 10.01.2026/Adrian Turion - Richemont - Resume.docx
@@ -438,19 +438,21 @@
                 <w:rFonts w:ascii="Times New Roman" w:hAnsi="Times New Roman"/>
                 <w:sz w:val="20"/>
               </w:rPr>
-              <w:t>M&amp;A Analyst with 2+ years of finance experience seeking to join Richemont's Finance Accelerator Program. Built 360-degree finance skills through financial modeling, FP&amp;A, and cross-functional deal execution across healthcare, tech, and luxury sectors. Proven ability to drive value creation in lean teams with an agility mindset, collaborating with legal, tax, and accounting advisors on cross-border transactions.</w:t>
-            </w:r>
-            <w:r>
-              <w:rPr>
-                <w:rFonts w:ascii="Times New Roman" w:hAnsi="Times New Roman"/>
-                <w:sz w:val="20"/>
-              </w:rPr>
-            </w:r>
-            <w:r>
-              <w:rPr>
-                <w:rFonts w:ascii="Times New Roman" w:hAnsi="Times New Roman"/>
-                <w:sz w:val="20"/>
-              </w:rPr>
+              <w:t>M&amp;A Analyst with 2+ years of finance experience seeking to join Richemont's Finance Accelerator Program. Built 360-degree finance skills through financial modeling, FP&amp;A, and cross-functional deal execution across healthcare</w:t>
+            </w:r>
+            <w:r>
+              <w:rPr>
+                <w:rFonts w:ascii="Times New Roman" w:hAnsi="Times New Roman"/>
+                <w:sz w:val="20"/>
+              </w:rPr>
+              <w:t xml:space="preserve"> and </w:t>
+            </w:r>
+            <w:r>
+              <w:rPr>
+                <w:rFonts w:ascii="Times New Roman" w:hAnsi="Times New Roman"/>
+                <w:sz w:val="20"/>
+              </w:rPr>
+              <w:t>tech. Proven ability to drive value creation in lean teams with an agility mindset, collaborating with legal, tax, and accounting advisors on cross-border transactions.</w:t>
             </w:r>
           </w:p>
         </w:tc>
@@ -806,18 +808,6 @@
               </w:rPr>
               <w:t>Built detailed financial models (LBO, DCF, trading comps, precedent transactions) and prepared client presentations for Board meetings and investor pitches across 10+ live mandates in healthcare, tech, and luxury sectors</w:t>
             </w:r>
-            <w:r>
-              <w:rPr>
-                <w:rFonts w:ascii="Times New Roman" w:hAnsi="Times New Roman"/>
-                <w:sz w:val="20"/>
-              </w:rPr>
-            </w:r>
-            <w:r>
-              <w:rPr>
-                <w:rFonts w:ascii="Times New Roman" w:hAnsi="Times New Roman"/>
-                <w:sz w:val="20"/>
-              </w:rPr>
-            </w:r>
           </w:p>
           <w:p>
             <w:pPr>
@@ -841,18 +831,6 @@
               </w:rPr>
               <w:t>End-to-end execution exposure in a lean 3-person deal team covering sourcing, valuation, due diligence, negotiations, and closing for cross-border deals ranging EUR 5M-50M across Europe, US, and Asia</w:t>
             </w:r>
-            <w:r>
-              <w:rPr>
-                <w:rFonts w:ascii="Times New Roman" w:hAnsi="Times New Roman"/>
-                <w:sz w:val="20"/>
-              </w:rPr>
-            </w:r>
-            <w:r>
-              <w:rPr>
-                <w:rFonts w:ascii="Times New Roman" w:hAnsi="Times New Roman"/>
-                <w:sz w:val="20"/>
-              </w:rPr>
-            </w:r>
           </w:p>
           <w:p>
             <w:pPr>
@@ -875,18 +853,6 @@
                 <w:sz w:val="20"/>
               </w:rPr>
               <w:t>Coordinated with legal, tax, and accounting advisors to structure transactions and negotiate deal terms; managed data rooms, buyer universes, and client relationships throughout transaction lifecycle</w:t>
-            </w:r>
-            <w:r>
-              <w:rPr>
-                <w:rFonts w:ascii="Times New Roman" w:hAnsi="Times New Roman"/>
-                <w:sz w:val="20"/>
-              </w:rPr>
-            </w:r>
-            <w:r>
-              <w:rPr>
-                <w:rFonts w:ascii="Times New Roman" w:hAnsi="Times New Roman"/>
-                <w:sz w:val="20"/>
-              </w:rPr>
             </w:r>
           </w:p>
           <w:p>
@@ -1112,18 +1078,6 @@
               </w:rPr>
               <w:t>Conducted financial and operational due diligence on 3 acquisition targets (EUR 10M-30M revenues) working directly with Healthcare and Retail divisional CEOs; prepared investment memos with market analysis, competitive positioning, and financial projections for potential acquisitions in France and Belgium</w:t>
             </w:r>
-            <w:r>
-              <w:rPr>
-                <w:rFonts w:ascii="Times New Roman" w:hAnsi="Times New Roman"/>
-                <w:sz w:val="20"/>
-              </w:rPr>
-            </w:r>
-            <w:r>
-              <w:rPr>
-                <w:rFonts w:ascii="Times New Roman" w:hAnsi="Times New Roman"/>
-                <w:sz w:val="20"/>
-              </w:rPr>
-            </w:r>
           </w:p>
           <w:p>
             <w:pPr>
@@ -1334,18 +1288,6 @@
                 <w:sz w:val="20"/>
               </w:rPr>
               <w:t>Supported CFO and Head of Controlling on FP&amp;A for CHF 50M+ Swiss subsidiary; built automated financial dashboards in Excel and PowerBI tracking KPIs, performed variance analysis on monthly P&amp;L, and assisted in annual budget planning and quarterly rolling forecasts for 5 business units</w:t>
-            </w:r>
-            <w:r>
-              <w:rPr>
-                <w:rFonts w:ascii="Times New Roman" w:hAnsi="Times New Roman"/>
-                <w:sz w:val="20"/>
-              </w:rPr>
-            </w:r>
-            <w:r>
-              <w:rPr>
-                <w:rFonts w:ascii="Times New Roman" w:hAnsi="Times New Roman"/>
-                <w:sz w:val="20"/>
-              </w:rPr>
             </w:r>
           </w:p>
           <w:p>
@@ -1432,18 +1374,6 @@
               </w:rPr>
               <w:t>Finalist - McKinsey Business Case: Developed data-driven model forecasting black swan events using order book data and statistical arbitrage; presented to Keyrock management (CHF 200K potential revenue)</w:t>
             </w:r>
-            <w:r>
-              <w:rPr>
-                <w:rFonts w:ascii="Times New Roman" w:hAnsi="Times New Roman"/>
-                <w:sz w:val="20"/>
-              </w:rPr>
-            </w:r>
-            <w:r>
-              <w:rPr>
-                <w:rFonts w:ascii="Times New Roman" w:hAnsi="Times New Roman"/>
-                <w:sz w:val="20"/>
-              </w:rPr>
-            </w:r>
           </w:p>
           <w:p>
             <w:pPr>
@@ -1467,18 +1397,6 @@
               </w:rPr>
               <w:t>Founder - Screeny.ai: Built full-stack AI-driven buyer identification software for M&amp;A boutiques and PE firms; adopted by 3 advisory firms, reducing strategic buyer search time from 10h+ to 20min</w:t>
             </w:r>
-            <w:r>
-              <w:rPr>
-                <w:rFonts w:ascii="Times New Roman" w:hAnsi="Times New Roman"/>
-                <w:sz w:val="20"/>
-              </w:rPr>
-            </w:r>
-            <w:r>
-              <w:rPr>
-                <w:rFonts w:ascii="Times New Roman" w:hAnsi="Times New Roman"/>
-                <w:sz w:val="20"/>
-              </w:rPr>
-            </w:r>
           </w:p>
           <w:p>
             <w:pPr>
@@ -1501,18 +1419,6 @@
                 <w:sz w:val="20"/>
               </w:rPr>
               <w:t>Manager - Personal Investment Portfolio: Execute disciplined options strategies (Cash Secured Puts, Covered Calls) with 45-day expiries generating +8% annualized returns on 15-20 active positions</w:t>
-            </w:r>
-            <w:r>
-              <w:rPr>
-                <w:rFonts w:ascii="Times New Roman" w:hAnsi="Times New Roman"/>
-                <w:sz w:val="20"/>
-              </w:rPr>
-            </w:r>
-            <w:r>
-              <w:rPr>
-                <w:rFonts w:ascii="Times New Roman" w:hAnsi="Times New Roman"/>
-                <w:sz w:val="20"/>
-              </w:rPr>
             </w:r>
           </w:p>
         </w:tc>
@@ -1813,24 +1719,6 @@
               </w:rPr>
               <w:t>Relevant Coursework: Corporate Finance, Valuation, Financial Accounting, Quantitative Asset and Risk Management</w:t>
             </w:r>
-            <w:r>
-              <w:rPr>
-                <w:rFonts w:ascii="Times New Roman" w:hAnsi="Times New Roman"/>
-                <w:sz w:val="20"/>
-              </w:rPr>
-            </w:r>
-            <w:r>
-              <w:rPr>
-                <w:rFonts w:ascii="Times New Roman" w:hAnsi="Times New Roman"/>
-                <w:sz w:val="20"/>
-              </w:rPr>
-            </w:r>
-            <w:r>
-              <w:rPr>
-                <w:rFonts w:ascii="Times New Roman" w:hAnsi="Times New Roman"/>
-                <w:sz w:val="20"/>
-              </w:rPr>
-            </w:r>
           </w:p>
           <w:p>
             <w:pPr>
@@ -2461,20 +2349,6 @@
               </w:rPr>
               <w:t>Financial Modeling (LBO, DCF) | FP&amp;A | Data Analysis (Excel, PowerBI) | SAP | Bloomberg</w:t>
             </w:r>
-            <w:r>
-              <w:rPr>
-                <w:rFonts w:ascii="Times New Roman" w:hAnsi="Times New Roman"/>
-                <w:sz w:val="20"/>
-                <w:szCs w:val="20"/>
-              </w:rPr>
-            </w:r>
-            <w:r>
-              <w:rPr>
-                <w:rFonts w:ascii="Times New Roman" w:hAnsi="Times New Roman"/>
-                <w:sz w:val="20"/>
-                <w:szCs w:val="20"/>
-              </w:rPr>
-            </w:r>
           </w:p>
           <w:p>
             <w:pPr>
@@ -2607,6 +2481,7 @@
         </w:tc>
       </w:tr>
     </w:tbl>
+    <w:p/>
     <w:sectPr>
       <w:headerReference w:type="even" r:id="rId9"/>
       <w:headerReference w:type="default" r:id="rId10"/>

</xml_diff>